<commit_message>
Refocus portfolio on enterprise AI with cobalt typography and updated CV
Curate flagship projects, clarify delivery and research scope, refresh the CV and update phone number to +61 409 334 038. Use Space Grotesk and cobalt styling.
</commit_message>
<xml_diff>
--- a/dist/assets/Flynn-Chambers-CV.docx
+++ b/dist/assets/Flynn-Chambers-CV.docx
@@ -15,12 +15,12 @@
         <w:pStyle w:val="Subtitle"/>
       </w:pPr>
       <w:r>
-        <w:t>AI Transformation | Solutions Consultant</w:t>
+        <w:t>Enterprise AI | Solutions Engineering</w:t>
       </w:r>
     </w:p>
     <w:p>
       <w:r>
-        <w:t>Brisbane, Australia · flynnguychambers@gmail.com · +61 411 679 512</w:t>
+        <w:t>Brisbane, Australia · flynnguychambers@gmail.com · +61 409 334 038</w:t>
       </w:r>
     </w:p>
     <w:p>
@@ -38,7 +38,7 @@
     </w:p>
     <w:p>
       <w:r>
-        <w:t>Solutions consultant combining client discovery, AI enablement and hands-on engineering across Microsoft cloud, security and software. Translate business workflows into scoped delivery plans, assess data and governance prerequisites, and build tools and integrations that connect AI to everyday operations. Master of Information Technology in Cyber Security, with experience spanning managed services, technical training and SaaS leadership. Seeking temporary or fixed-term AI transformation roles in Brisbane.</w:t>
+        <w:t>Solutions consultant and engineer building AI integrations for business workflows, with experience across software, Microsoft cloud, identity and security. Own work from discovery and technical scoping through implementation and handover. Current work includes internal quoting software, REST APIs and MCP integrations; wider experience includes local LLM security research, enterprise AI assistant deployment and SaaS leadership. Master of Information Technology in Cyber Security.</w:t>
       </w:r>
     </w:p>
     <w:p>
@@ -51,7 +51,7 @@
     </w:p>
     <w:p>
       <w:r>
-        <w:t>AI readiness and discovery · Workflow analysis · Stakeholder engagement · Proposals and SOWs · API and MCP integration · Microsoft 365 and Copilot readiness · Data governance · Cloud and security delivery</w:t>
+        <w:t>AI application integration · REST APIs and MCP · Technical solution design · Microsoft cloud and identity · Security and data governance · Workflow discovery · Stakeholder engagement · Delivery ownership</w:t>
       </w:r>
     </w:p>
     <w:p>
@@ -89,7 +89,7 @@
         <w:spacing w:after="80"/>
       </w:pPr>
       <w:r>
-        <w:t>Lead discovery, scope solutions and prepare phased proposals across AI, Microsoft 365, infrastructure and security, translating business requirements into delivery plans.</w:t>
+        <w:t>Develop internal quoting software across a full-stack application, Docker packaging, REST APIs and MCP integration; designed the pricing matrix supporting the team's quoting workflow.</w:t>
       </w:r>
     </w:p>
     <w:p>
@@ -98,7 +98,7 @@
         <w:spacing w:after="80"/>
       </w:pPr>
       <w:r>
-        <w:t>Shape the AI consulting offering, including AI Readiness QuickScan, Copilot Readiness Check and AI Maturity Assessment tools and lead capture flows.</w:t>
+        <w:t>Own integration work connecting AI tooling to catalog quoting operations, including authentication, routing, supported actions and reference stability; document workflows and technical handovers.</w:t>
       </w:r>
     </w:p>
     <w:p>
@@ -116,7 +116,7 @@
         <w:spacing w:after="80"/>
       </w:pPr>
       <w:r>
-        <w:t>Develop internal quoting tools and API/MCP integrations; diagnose authentication and routing issues, map tool gaps and document catalog workflows and handovers.</w:t>
+        <w:t>Shape the AI consulting offering through readiness assessments and discovery, translating business requirements into phased implementation proposals.</w:t>
       </w:r>
     </w:p>
     <w:p>
@@ -125,16 +125,7 @@
         <w:spacing w:after="80"/>
       </w:pPr>
       <w:r>
-        <w:t>Scope AI enablement with sensitivity labels, DLP and Conditional Access prerequisites; deliver tenant audits, Essential Eight assessments and incident response planning.</w:t>
-      </w:r>
-    </w:p>
-    <w:p>
-      <w:pPr>
-        <w:pStyle w:val="ListBullet"/>
-        <w:spacing w:after="80"/>
-      </w:pPr>
-      <w:r>
-        <w:t>Combine client-facing consulting with hands-on delivery across Entra ID, Intune, Defender, Azure, SharePoint and network automation using NetBox and Python.</w:t>
+        <w:t>Scope the identity, data governance and security foundations for AI adoption, including sensitivity labels, DLP and Conditional Access; deliver work across Microsoft 365, Entra ID, Azure and SharePoint.</w:t>
       </w:r>
     </w:p>
     <w:p>
@@ -173,7 +164,16 @@
         <w:spacing w:after="80"/>
       </w:pPr>
       <w:r>
-        <w:t>Deployed AI agents and automation into client environments, including cross-tenant identity synchronisation.</w:t>
+        <w:t>Deployed AI agents and workflow automation into client environments.</w:t>
+      </w:r>
+    </w:p>
+    <w:p>
+      <w:pPr>
+        <w:pStyle w:val="ListBullet"/>
+        <w:spacing w:after="80"/>
+      </w:pPr>
+      <w:r>
+        <w:t>Delivered identity automation, including cross-tenant synchronisation.</w:t>
       </w:r>
     </w:p>
     <w:p>
@@ -186,9 +186,7 @@
       </w:r>
     </w:p>
     <w:p>
-      <w:r>
-        <w:br w:type="page"/>
-      </w:r>
+      <w:r/>
     </w:p>
     <w:p>
       <w:pPr>
@@ -354,7 +352,7 @@
         <w:spacing w:after="80"/>
       </w:pPr>
       <w:r>
-        <w:t>Integrated an AI assistant with Microsoft 365 using Entra app registration, OAuth and Microsoft Graph; researched risks including token exposure and prompt injection.</w:t>
+        <w:t>Deployed and integrated an existing AI assistant platform with Microsoft 365 using Entra app registration, OAuth and Microsoft Graph; researched token exposure and prompt injection risks.</w:t>
       </w:r>
     </w:p>
     <w:p>

</xml_diff>

<commit_message>
Expand AI platform experience and strengthen Smile IT delivery evidence
Feature enterprise MCP and Iris work, correct BENCH status, remove unsupported Discovery Companion and refresh downloadable CVs.
</commit_message>
<xml_diff>
--- a/dist/assets/Flynn-Chambers-CV.docx
+++ b/dist/assets/Flynn-Chambers-CV.docx
@@ -38,7 +38,7 @@
     </w:p>
     <w:p>
       <w:r>
-        <w:t>Solutions consultant and engineer building AI integrations for business workflows, with experience across software, Microsoft cloud, identity and security. Own work from discovery and technical scoping through implementation and handover. Current work includes internal quoting software, REST APIs and MCP integrations; wider experience includes local LLM security research, enterprise AI assistant deployment and SaaS leadership. Master of Information Technology in Cyber Security.</w:t>
+        <w:t>Solutions consultant and engineer delivering enterprise AI integrations, agent workflows and adoption programmes. Broad hands-on experience across Claude, OpenAI, OpenRouter, Microsoft Copilot and local models, supported by software engineering, Microsoft cloud, identity and security. Own work from discovery and solution design through implementation and handover. Experience includes production MCP integration, governed agent development and SaaS leadership. Master of Information Technology in Cyber Security.</w:t>
       </w:r>
     </w:p>
     <w:p>
@@ -80,7 +80,7 @@
           <w:i/>
           <w:sz w:val="18"/>
         </w:rPr>
-        <w:t>2026 – Present · Brisbane</w:t>
+        <w:t>April 2026 – Present · Brisbane</w:t>
       </w:r>
     </w:p>
     <w:p>
@@ -89,7 +89,7 @@
         <w:spacing w:after="80"/>
       </w:pPr>
       <w:r>
-        <w:t>Develop internal quoting software across a full-stack application, Docker packaging, REST APIs and MCP integration; designed the pricing matrix supporting the team's quoting workflow.</w:t>
+        <w:t>Built and deployed a read-only MCP server connecting a business platform to AI tools, using FastMCP, Azure Container Apps and Entra ID; designed access gates and encrypted token storage, and shipped a tested security fix.</w:t>
       </w:r>
     </w:p>
     <w:p>
@@ -98,7 +98,7 @@
         <w:spacing w:after="80"/>
       </w:pPr>
       <w:r>
-        <w:t>Own integration work connecting AI tooling to catalog quoting operations, including authentication, routing, supported actions and reference stability; document workflows and technical handovers.</w:t>
+        <w:t>Build Iris, a governed agent platform integrating Halo PSA and Microsoft 365, with Docker sandboxing, scoped identity and draft-only workflows requiring a human to send. Development is ongoing.</w:t>
       </w:r>
     </w:p>
     <w:p>
@@ -107,7 +107,7 @@
         <w:spacing w:after="80"/>
       </w:pPr>
       <w:r>
-        <w:t>Build a Discovery Session Companion using HTML/JavaScript and the Anthropic API to support scoping across workflow automation, bespoke development and autonomous agents.</w:t>
+        <w:t>Built BENCH with Next.js, TypeScript, PostgreSQL and Halo PSA integration. Quoting was trialled and demonstrated; the leads module is live and used by the sales team.</w:t>
       </w:r>
     </w:p>
     <w:p>
@@ -116,7 +116,7 @@
         <w:spacing w:after="80"/>
       </w:pPr>
       <w:r>
-        <w:t>Shape the AI consulting offering through readiness assessments and discovery, translating business requirements into phased implementation proposals.</w:t>
+        <w:t>Deliver AI readiness assessments and remediation planning across identity, permissions, data exposure and governance; turn findings into practical implementation scopes.</w:t>
       </w:r>
     </w:p>
     <w:p>
@@ -125,7 +125,16 @@
         <w:spacing w:after="80"/>
       </w:pPr>
       <w:r>
-        <w:t>Scope the identity, data governance and security foundations for AI adoption, including sensitivity labels, DLP and Conditional Access; deliver work across Microsoft 365, Entra ID, Azure and SharePoint.</w:t>
+        <w:t>Developed the AI and Automation service offering, pricing models and reusable delivery collateral; built and delivered foundational and advanced client AI training.</w:t>
+      </w:r>
+    </w:p>
+    <w:p>
+      <w:pPr>
+        <w:pStyle w:val="ListBullet"/>
+        <w:spacing w:after="80"/>
+      </w:pPr>
+      <w:r>
+        <w:t>Build reusable AI workflows with Claude Code, MCP and APIs, including opportunity monitoring, proposal drafting and reporting; apply broad platform experience across Claude, OpenAI, OpenRouter and Copilot.</w:t>
       </w:r>
     </w:p>
     <w:p>
@@ -186,7 +195,9 @@
       </w:r>
     </w:p>
     <w:p>
-      <w:r/>
+      <w:r>
+        <w:br w:type="page"/>
+      </w:r>
     </w:p>
     <w:p>
       <w:pPr>
@@ -437,7 +448,7 @@
     </w:p>
     <w:p>
       <w:r>
-        <w:t>AI and development: Anthropic API, Claude Code, MCP, Python, TypeScript, React, Next.js, Node.js, REST APIs, Docker and Git.</w:t>
+        <w:t>AI platforms and engineering: Claude / Anthropic API, Claude Code, OpenAI, OpenRouter, Microsoft Copilot, Copilot Studio, Cursor, MCP / FastMCP, local LLMs, Python, TypeScript, React, Next.js, REST APIs, Docker and Git.</w:t>
       </w:r>
     </w:p>
     <w:p>

</xml_diff>